<commit_message>
Actualiza niveles Tec Plantilla 5
</commit_message>
<xml_diff>
--- a/plantillas/Plantilla_5_MarcoEtico.docx
+++ b/plantillas/Plantilla_5_MarcoEtico.docx
@@ -931,12 +931,6 @@
               <w:bottom w:val="single" w:sz="4" w:space="0" w:color="000000"/>
               <w:right w:val="single" w:sz="4" w:space="0" w:color="000000"/>
             </w:tcBorders>
-            <w:tcBorders>
-              <w:top w:val="single" w:sz="4" w:space="0" w:color="000000"/>
-              <w:left w:val="single" w:sz="4" w:space="0" w:color="000000"/>
-              <w:bottom w:val="single" w:sz="4" w:space="0" w:color="000000"/>
-              <w:right w:val="single" w:sz="4" w:space="0" w:color="000000"/>
-            </w:tcBorders>
           </w:tcPr>
           <w:p>
             <w:pPr>
@@ -955,12 +949,6 @@
               <w:bottom w:val="single" w:sz="4" w:space="0" w:color="000000"/>
               <w:right w:val="single" w:sz="4" w:space="0" w:color="000000"/>
             </w:tcBorders>
-            <w:tcBorders>
-              <w:top w:val="single" w:sz="4" w:space="0" w:color="000000"/>
-              <w:left w:val="single" w:sz="4" w:space="0" w:color="000000"/>
-              <w:bottom w:val="single" w:sz="4" w:space="0" w:color="000000"/>
-              <w:right w:val="single" w:sz="4" w:space="0" w:color="000000"/>
-            </w:tcBorders>
           </w:tcPr>
           <w:p>
             <w:pPr>
@@ -979,12 +967,6 @@
               <w:bottom w:val="single" w:sz="4" w:space="0" w:color="000000"/>
               <w:right w:val="single" w:sz="4" w:space="0" w:color="000000"/>
             </w:tcBorders>
-            <w:tcBorders>
-              <w:top w:val="single" w:sz="4" w:space="0" w:color="000000"/>
-              <w:left w:val="single" w:sz="4" w:space="0" w:color="000000"/>
-              <w:bottom w:val="single" w:sz="4" w:space="0" w:color="000000"/>
-              <w:right w:val="single" w:sz="4" w:space="0" w:color="000000"/>
-            </w:tcBorders>
           </w:tcPr>
           <w:p>
             <w:pPr>
@@ -997,12 +979,6 @@
         </w:tc>
         <w:tc>
           <w:tcPr>
-            <w:tcBorders>
-              <w:top w:val="single" w:sz="4" w:space="0" w:color="000000"/>
-              <w:left w:val="single" w:sz="4" w:space="0" w:color="000000"/>
-              <w:bottom w:val="single" w:sz="4" w:space="0" w:color="000000"/>
-              <w:right w:val="single" w:sz="4" w:space="0" w:color="000000"/>
-            </w:tcBorders>
             <w:tcBorders>
               <w:top w:val="single" w:sz="4" w:space="0" w:color="000000"/>
               <w:left w:val="single" w:sz="4" w:space="0" w:color="000000"/>
@@ -1029,69 +1005,45 @@
               <w:bottom w:val="single" w:sz="4" w:space="0" w:color="000000"/>
               <w:right w:val="single" w:sz="4" w:space="0" w:color="000000"/>
             </w:tcBorders>
-            <w:tcBorders>
-              <w:top w:val="single" w:sz="4" w:space="0" w:color="000000"/>
-              <w:left w:val="single" w:sz="4" w:space="0" w:color="000000"/>
-              <w:bottom w:val="single" w:sz="4" w:space="0" w:color="000000"/>
-              <w:right w:val="single" w:sz="4" w:space="0" w:color="000000"/>
-            </w:tcBorders>
-          </w:tcPr>
-          <w:p>
-            <w:pPr>
-              <w:pStyle w:val="Compact"/>
-            </w:pPr>
-          </w:p>
-        </w:tc>
-        <w:tc>
-          <w:tcPr>
-            <w:tcBorders>
-              <w:top w:val="single" w:sz="4" w:space="0" w:color="000000"/>
-              <w:left w:val="single" w:sz="4" w:space="0" w:color="000000"/>
-              <w:bottom w:val="single" w:sz="4" w:space="0" w:color="000000"/>
-              <w:right w:val="single" w:sz="4" w:space="0" w:color="000000"/>
-            </w:tcBorders>
-            <w:tcBorders>
-              <w:top w:val="single" w:sz="4" w:space="0" w:color="000000"/>
-              <w:left w:val="single" w:sz="4" w:space="0" w:color="000000"/>
-              <w:bottom w:val="single" w:sz="4" w:space="0" w:color="000000"/>
-              <w:right w:val="single" w:sz="4" w:space="0" w:color="000000"/>
-            </w:tcBorders>
-          </w:tcPr>
-          <w:p>
-            <w:pPr>
-              <w:pStyle w:val="Compact"/>
-            </w:pPr>
-          </w:p>
-        </w:tc>
-        <w:tc>
-          <w:tcPr>
-            <w:tcBorders>
-              <w:top w:val="single" w:sz="4" w:space="0" w:color="000000"/>
-              <w:left w:val="single" w:sz="4" w:space="0" w:color="000000"/>
-              <w:bottom w:val="single" w:sz="4" w:space="0" w:color="000000"/>
-              <w:right w:val="single" w:sz="4" w:space="0" w:color="000000"/>
-            </w:tcBorders>
-            <w:tcBorders>
-              <w:top w:val="single" w:sz="4" w:space="0" w:color="000000"/>
-              <w:left w:val="single" w:sz="4" w:space="0" w:color="000000"/>
-              <w:bottom w:val="single" w:sz="4" w:space="0" w:color="000000"/>
-              <w:right w:val="single" w:sz="4" w:space="0" w:color="000000"/>
-            </w:tcBorders>
-          </w:tcPr>
-          <w:p>
-            <w:pPr>
-              <w:pStyle w:val="Compact"/>
-            </w:pPr>
-          </w:p>
-        </w:tc>
-        <w:tc>
-          <w:tcPr>
-            <w:tcBorders>
-              <w:top w:val="single" w:sz="4" w:space="0" w:color="000000"/>
-              <w:left w:val="single" w:sz="4" w:space="0" w:color="000000"/>
-              <w:bottom w:val="single" w:sz="4" w:space="0" w:color="000000"/>
-              <w:right w:val="single" w:sz="4" w:space="0" w:color="000000"/>
-            </w:tcBorders>
+          </w:tcPr>
+          <w:p>
+            <w:pPr>
+              <w:pStyle w:val="Compact"/>
+            </w:pPr>
+          </w:p>
+        </w:tc>
+        <w:tc>
+          <w:tcPr>
+            <w:tcBorders>
+              <w:top w:val="single" w:sz="4" w:space="0" w:color="000000"/>
+              <w:left w:val="single" w:sz="4" w:space="0" w:color="000000"/>
+              <w:bottom w:val="single" w:sz="4" w:space="0" w:color="000000"/>
+              <w:right w:val="single" w:sz="4" w:space="0" w:color="000000"/>
+            </w:tcBorders>
+          </w:tcPr>
+          <w:p>
+            <w:pPr>
+              <w:pStyle w:val="Compact"/>
+            </w:pPr>
+          </w:p>
+        </w:tc>
+        <w:tc>
+          <w:tcPr>
+            <w:tcBorders>
+              <w:top w:val="single" w:sz="4" w:space="0" w:color="000000"/>
+              <w:left w:val="single" w:sz="4" w:space="0" w:color="000000"/>
+              <w:bottom w:val="single" w:sz="4" w:space="0" w:color="000000"/>
+              <w:right w:val="single" w:sz="4" w:space="0" w:color="000000"/>
+            </w:tcBorders>
+          </w:tcPr>
+          <w:p>
+            <w:pPr>
+              <w:pStyle w:val="Compact"/>
+            </w:pPr>
+          </w:p>
+        </w:tc>
+        <w:tc>
+          <w:tcPr>
             <w:tcBorders>
               <w:top w:val="single" w:sz="4" w:space="0" w:color="000000"/>
               <w:left w:val="single" w:sz="4" w:space="0" w:color="000000"/>
@@ -1118,69 +1070,45 @@
               <w:bottom w:val="single" w:sz="4" w:space="0" w:color="000000"/>
               <w:right w:val="single" w:sz="4" w:space="0" w:color="000000"/>
             </w:tcBorders>
-            <w:tcBorders>
-              <w:top w:val="single" w:sz="4" w:space="0" w:color="000000"/>
-              <w:left w:val="single" w:sz="4" w:space="0" w:color="000000"/>
-              <w:bottom w:val="single" w:sz="4" w:space="0" w:color="000000"/>
-              <w:right w:val="single" w:sz="4" w:space="0" w:color="000000"/>
-            </w:tcBorders>
-          </w:tcPr>
-          <w:p>
-            <w:pPr>
-              <w:pStyle w:val="Compact"/>
-            </w:pPr>
-          </w:p>
-        </w:tc>
-        <w:tc>
-          <w:tcPr>
-            <w:tcBorders>
-              <w:top w:val="single" w:sz="4" w:space="0" w:color="000000"/>
-              <w:left w:val="single" w:sz="4" w:space="0" w:color="000000"/>
-              <w:bottom w:val="single" w:sz="4" w:space="0" w:color="000000"/>
-              <w:right w:val="single" w:sz="4" w:space="0" w:color="000000"/>
-            </w:tcBorders>
-            <w:tcBorders>
-              <w:top w:val="single" w:sz="4" w:space="0" w:color="000000"/>
-              <w:left w:val="single" w:sz="4" w:space="0" w:color="000000"/>
-              <w:bottom w:val="single" w:sz="4" w:space="0" w:color="000000"/>
-              <w:right w:val="single" w:sz="4" w:space="0" w:color="000000"/>
-            </w:tcBorders>
-          </w:tcPr>
-          <w:p>
-            <w:pPr>
-              <w:pStyle w:val="Compact"/>
-            </w:pPr>
-          </w:p>
-        </w:tc>
-        <w:tc>
-          <w:tcPr>
-            <w:tcBorders>
-              <w:top w:val="single" w:sz="4" w:space="0" w:color="000000"/>
-              <w:left w:val="single" w:sz="4" w:space="0" w:color="000000"/>
-              <w:bottom w:val="single" w:sz="4" w:space="0" w:color="000000"/>
-              <w:right w:val="single" w:sz="4" w:space="0" w:color="000000"/>
-            </w:tcBorders>
-            <w:tcBorders>
-              <w:top w:val="single" w:sz="4" w:space="0" w:color="000000"/>
-              <w:left w:val="single" w:sz="4" w:space="0" w:color="000000"/>
-              <w:bottom w:val="single" w:sz="4" w:space="0" w:color="000000"/>
-              <w:right w:val="single" w:sz="4" w:space="0" w:color="000000"/>
-            </w:tcBorders>
-          </w:tcPr>
-          <w:p>
-            <w:pPr>
-              <w:pStyle w:val="Compact"/>
-            </w:pPr>
-          </w:p>
-        </w:tc>
-        <w:tc>
-          <w:tcPr>
-            <w:tcBorders>
-              <w:top w:val="single" w:sz="4" w:space="0" w:color="000000"/>
-              <w:left w:val="single" w:sz="4" w:space="0" w:color="000000"/>
-              <w:bottom w:val="single" w:sz="4" w:space="0" w:color="000000"/>
-              <w:right w:val="single" w:sz="4" w:space="0" w:color="000000"/>
-            </w:tcBorders>
+          </w:tcPr>
+          <w:p>
+            <w:pPr>
+              <w:pStyle w:val="Compact"/>
+            </w:pPr>
+          </w:p>
+        </w:tc>
+        <w:tc>
+          <w:tcPr>
+            <w:tcBorders>
+              <w:top w:val="single" w:sz="4" w:space="0" w:color="000000"/>
+              <w:left w:val="single" w:sz="4" w:space="0" w:color="000000"/>
+              <w:bottom w:val="single" w:sz="4" w:space="0" w:color="000000"/>
+              <w:right w:val="single" w:sz="4" w:space="0" w:color="000000"/>
+            </w:tcBorders>
+          </w:tcPr>
+          <w:p>
+            <w:pPr>
+              <w:pStyle w:val="Compact"/>
+            </w:pPr>
+          </w:p>
+        </w:tc>
+        <w:tc>
+          <w:tcPr>
+            <w:tcBorders>
+              <w:top w:val="single" w:sz="4" w:space="0" w:color="000000"/>
+              <w:left w:val="single" w:sz="4" w:space="0" w:color="000000"/>
+              <w:bottom w:val="single" w:sz="4" w:space="0" w:color="000000"/>
+              <w:right w:val="single" w:sz="4" w:space="0" w:color="000000"/>
+            </w:tcBorders>
+          </w:tcPr>
+          <w:p>
+            <w:pPr>
+              <w:pStyle w:val="Compact"/>
+            </w:pPr>
+          </w:p>
+        </w:tc>
+        <w:tc>
+          <w:tcPr>
             <w:tcBorders>
               <w:top w:val="single" w:sz="4" w:space="0" w:color="000000"/>
               <w:left w:val="single" w:sz="4" w:space="0" w:color="000000"/>
@@ -1207,69 +1135,45 @@
               <w:bottom w:val="single" w:sz="4" w:space="0" w:color="000000"/>
               <w:right w:val="single" w:sz="4" w:space="0" w:color="000000"/>
             </w:tcBorders>
-            <w:tcBorders>
-              <w:top w:val="single" w:sz="4" w:space="0" w:color="000000"/>
-              <w:left w:val="single" w:sz="4" w:space="0" w:color="000000"/>
-              <w:bottom w:val="single" w:sz="4" w:space="0" w:color="000000"/>
-              <w:right w:val="single" w:sz="4" w:space="0" w:color="000000"/>
-            </w:tcBorders>
-          </w:tcPr>
-          <w:p>
-            <w:pPr>
-              <w:pStyle w:val="Compact"/>
-            </w:pPr>
-          </w:p>
-        </w:tc>
-        <w:tc>
-          <w:tcPr>
-            <w:tcBorders>
-              <w:top w:val="single" w:sz="4" w:space="0" w:color="000000"/>
-              <w:left w:val="single" w:sz="4" w:space="0" w:color="000000"/>
-              <w:bottom w:val="single" w:sz="4" w:space="0" w:color="000000"/>
-              <w:right w:val="single" w:sz="4" w:space="0" w:color="000000"/>
-            </w:tcBorders>
-            <w:tcBorders>
-              <w:top w:val="single" w:sz="4" w:space="0" w:color="000000"/>
-              <w:left w:val="single" w:sz="4" w:space="0" w:color="000000"/>
-              <w:bottom w:val="single" w:sz="4" w:space="0" w:color="000000"/>
-              <w:right w:val="single" w:sz="4" w:space="0" w:color="000000"/>
-            </w:tcBorders>
-          </w:tcPr>
-          <w:p>
-            <w:pPr>
-              <w:pStyle w:val="Compact"/>
-            </w:pPr>
-          </w:p>
-        </w:tc>
-        <w:tc>
-          <w:tcPr>
-            <w:tcBorders>
-              <w:top w:val="single" w:sz="4" w:space="0" w:color="000000"/>
-              <w:left w:val="single" w:sz="4" w:space="0" w:color="000000"/>
-              <w:bottom w:val="single" w:sz="4" w:space="0" w:color="000000"/>
-              <w:right w:val="single" w:sz="4" w:space="0" w:color="000000"/>
-            </w:tcBorders>
-            <w:tcBorders>
-              <w:top w:val="single" w:sz="4" w:space="0" w:color="000000"/>
-              <w:left w:val="single" w:sz="4" w:space="0" w:color="000000"/>
-              <w:bottom w:val="single" w:sz="4" w:space="0" w:color="000000"/>
-              <w:right w:val="single" w:sz="4" w:space="0" w:color="000000"/>
-            </w:tcBorders>
-          </w:tcPr>
-          <w:p>
-            <w:pPr>
-              <w:pStyle w:val="Compact"/>
-            </w:pPr>
-          </w:p>
-        </w:tc>
-        <w:tc>
-          <w:tcPr>
-            <w:tcBorders>
-              <w:top w:val="single" w:sz="4" w:space="0" w:color="000000"/>
-              <w:left w:val="single" w:sz="4" w:space="0" w:color="000000"/>
-              <w:bottom w:val="single" w:sz="4" w:space="0" w:color="000000"/>
-              <w:right w:val="single" w:sz="4" w:space="0" w:color="000000"/>
-            </w:tcBorders>
+          </w:tcPr>
+          <w:p>
+            <w:pPr>
+              <w:pStyle w:val="Compact"/>
+            </w:pPr>
+          </w:p>
+        </w:tc>
+        <w:tc>
+          <w:tcPr>
+            <w:tcBorders>
+              <w:top w:val="single" w:sz="4" w:space="0" w:color="000000"/>
+              <w:left w:val="single" w:sz="4" w:space="0" w:color="000000"/>
+              <w:bottom w:val="single" w:sz="4" w:space="0" w:color="000000"/>
+              <w:right w:val="single" w:sz="4" w:space="0" w:color="000000"/>
+            </w:tcBorders>
+          </w:tcPr>
+          <w:p>
+            <w:pPr>
+              <w:pStyle w:val="Compact"/>
+            </w:pPr>
+          </w:p>
+        </w:tc>
+        <w:tc>
+          <w:tcPr>
+            <w:tcBorders>
+              <w:top w:val="single" w:sz="4" w:space="0" w:color="000000"/>
+              <w:left w:val="single" w:sz="4" w:space="0" w:color="000000"/>
+              <w:bottom w:val="single" w:sz="4" w:space="0" w:color="000000"/>
+              <w:right w:val="single" w:sz="4" w:space="0" w:color="000000"/>
+            </w:tcBorders>
+          </w:tcPr>
+          <w:p>
+            <w:pPr>
+              <w:pStyle w:val="Compact"/>
+            </w:pPr>
+          </w:p>
+        </w:tc>
+        <w:tc>
+          <w:tcPr>
             <w:tcBorders>
               <w:top w:val="single" w:sz="4" w:space="0" w:color="000000"/>
               <w:left w:val="single" w:sz="4" w:space="0" w:color="000000"/>
@@ -1296,69 +1200,45 @@
               <w:bottom w:val="single" w:sz="4" w:space="0" w:color="000000"/>
               <w:right w:val="single" w:sz="4" w:space="0" w:color="000000"/>
             </w:tcBorders>
-            <w:tcBorders>
-              <w:top w:val="single" w:sz="4" w:space="0" w:color="000000"/>
-              <w:left w:val="single" w:sz="4" w:space="0" w:color="000000"/>
-              <w:bottom w:val="single" w:sz="4" w:space="0" w:color="000000"/>
-              <w:right w:val="single" w:sz="4" w:space="0" w:color="000000"/>
-            </w:tcBorders>
-          </w:tcPr>
-          <w:p>
-            <w:pPr>
-              <w:pStyle w:val="Compact"/>
-            </w:pPr>
-          </w:p>
-        </w:tc>
-        <w:tc>
-          <w:tcPr>
-            <w:tcBorders>
-              <w:top w:val="single" w:sz="4" w:space="0" w:color="000000"/>
-              <w:left w:val="single" w:sz="4" w:space="0" w:color="000000"/>
-              <w:bottom w:val="single" w:sz="4" w:space="0" w:color="000000"/>
-              <w:right w:val="single" w:sz="4" w:space="0" w:color="000000"/>
-            </w:tcBorders>
-            <w:tcBorders>
-              <w:top w:val="single" w:sz="4" w:space="0" w:color="000000"/>
-              <w:left w:val="single" w:sz="4" w:space="0" w:color="000000"/>
-              <w:bottom w:val="single" w:sz="4" w:space="0" w:color="000000"/>
-              <w:right w:val="single" w:sz="4" w:space="0" w:color="000000"/>
-            </w:tcBorders>
-          </w:tcPr>
-          <w:p>
-            <w:pPr>
-              <w:pStyle w:val="Compact"/>
-            </w:pPr>
-          </w:p>
-        </w:tc>
-        <w:tc>
-          <w:tcPr>
-            <w:tcBorders>
-              <w:top w:val="single" w:sz="4" w:space="0" w:color="000000"/>
-              <w:left w:val="single" w:sz="4" w:space="0" w:color="000000"/>
-              <w:bottom w:val="single" w:sz="4" w:space="0" w:color="000000"/>
-              <w:right w:val="single" w:sz="4" w:space="0" w:color="000000"/>
-            </w:tcBorders>
-            <w:tcBorders>
-              <w:top w:val="single" w:sz="4" w:space="0" w:color="000000"/>
-              <w:left w:val="single" w:sz="4" w:space="0" w:color="000000"/>
-              <w:bottom w:val="single" w:sz="4" w:space="0" w:color="000000"/>
-              <w:right w:val="single" w:sz="4" w:space="0" w:color="000000"/>
-            </w:tcBorders>
-          </w:tcPr>
-          <w:p>
-            <w:pPr>
-              <w:pStyle w:val="Compact"/>
-            </w:pPr>
-          </w:p>
-        </w:tc>
-        <w:tc>
-          <w:tcPr>
-            <w:tcBorders>
-              <w:top w:val="single" w:sz="4" w:space="0" w:color="000000"/>
-              <w:left w:val="single" w:sz="4" w:space="0" w:color="000000"/>
-              <w:bottom w:val="single" w:sz="4" w:space="0" w:color="000000"/>
-              <w:right w:val="single" w:sz="4" w:space="0" w:color="000000"/>
-            </w:tcBorders>
+          </w:tcPr>
+          <w:p>
+            <w:pPr>
+              <w:pStyle w:val="Compact"/>
+            </w:pPr>
+          </w:p>
+        </w:tc>
+        <w:tc>
+          <w:tcPr>
+            <w:tcBorders>
+              <w:top w:val="single" w:sz="4" w:space="0" w:color="000000"/>
+              <w:left w:val="single" w:sz="4" w:space="0" w:color="000000"/>
+              <w:bottom w:val="single" w:sz="4" w:space="0" w:color="000000"/>
+              <w:right w:val="single" w:sz="4" w:space="0" w:color="000000"/>
+            </w:tcBorders>
+          </w:tcPr>
+          <w:p>
+            <w:pPr>
+              <w:pStyle w:val="Compact"/>
+            </w:pPr>
+          </w:p>
+        </w:tc>
+        <w:tc>
+          <w:tcPr>
+            <w:tcBorders>
+              <w:top w:val="single" w:sz="4" w:space="0" w:color="000000"/>
+              <w:left w:val="single" w:sz="4" w:space="0" w:color="000000"/>
+              <w:bottom w:val="single" w:sz="4" w:space="0" w:color="000000"/>
+              <w:right w:val="single" w:sz="4" w:space="0" w:color="000000"/>
+            </w:tcBorders>
+          </w:tcPr>
+          <w:p>
+            <w:pPr>
+              <w:pStyle w:val="Compact"/>
+            </w:pPr>
+          </w:p>
+        </w:tc>
+        <w:tc>
+          <w:tcPr>
             <w:tcBorders>
               <w:top w:val="single" w:sz="4" w:space="0" w:color="000000"/>
               <w:left w:val="single" w:sz="4" w:space="0" w:color="000000"/>
@@ -1417,12 +1297,6 @@
               <w:bottom w:val="single" w:sz="4" w:space="0" w:color="000000"/>
               <w:right w:val="single" w:sz="4" w:space="0" w:color="000000"/>
             </w:tcBorders>
-            <w:tcBorders>
-              <w:top w:val="single" w:sz="4" w:space="0" w:color="000000"/>
-              <w:left w:val="single" w:sz="4" w:space="0" w:color="000000"/>
-              <w:bottom w:val="single" w:sz="4" w:space="0" w:color="000000"/>
-              <w:right w:val="single" w:sz="4" w:space="0" w:color="000000"/>
-            </w:tcBorders>
           </w:tcPr>
           <w:p>
             <w:pPr>
@@ -1435,12 +1309,6 @@
         </w:tc>
         <w:tc>
           <w:tcPr>
-            <w:tcBorders>
-              <w:top w:val="single" w:sz="4" w:space="0" w:color="000000"/>
-              <w:left w:val="single" w:sz="4" w:space="0" w:color="000000"/>
-              <w:bottom w:val="single" w:sz="4" w:space="0" w:color="000000"/>
-              <w:right w:val="single" w:sz="4" w:space="0" w:color="000000"/>
-            </w:tcBorders>
             <w:tcBorders>
               <w:top w:val="single" w:sz="4" w:space="0" w:color="000000"/>
               <w:left w:val="single" w:sz="4" w:space="0" w:color="000000"/>
@@ -1467,12 +1335,6 @@
               <w:bottom w:val="single" w:sz="4" w:space="0" w:color="000000"/>
               <w:right w:val="single" w:sz="4" w:space="0" w:color="000000"/>
             </w:tcBorders>
-            <w:tcBorders>
-              <w:top w:val="single" w:sz="4" w:space="0" w:color="000000"/>
-              <w:left w:val="single" w:sz="4" w:space="0" w:color="000000"/>
-              <w:bottom w:val="single" w:sz="4" w:space="0" w:color="000000"/>
-              <w:right w:val="single" w:sz="4" w:space="0" w:color="000000"/>
-            </w:tcBorders>
           </w:tcPr>
           <w:p>
             <w:pPr>
@@ -1485,12 +1347,6 @@
         </w:tc>
         <w:tc>
           <w:tcPr>
-            <w:tcBorders>
-              <w:top w:val="single" w:sz="4" w:space="0" w:color="000000"/>
-              <w:left w:val="single" w:sz="4" w:space="0" w:color="000000"/>
-              <w:bottom w:val="single" w:sz="4" w:space="0" w:color="000000"/>
-              <w:right w:val="single" w:sz="4" w:space="0" w:color="000000"/>
-            </w:tcBorders>
             <w:tcBorders>
               <w:top w:val="single" w:sz="4" w:space="0" w:color="000000"/>
               <w:left w:val="single" w:sz="4" w:space="0" w:color="000000"/>
@@ -1514,12 +1370,6 @@
               <w:bottom w:val="single" w:sz="4" w:space="0" w:color="000000"/>
               <w:right w:val="single" w:sz="4" w:space="0" w:color="000000"/>
             </w:tcBorders>
-            <w:tcBorders>
-              <w:top w:val="single" w:sz="4" w:space="0" w:color="000000"/>
-              <w:left w:val="single" w:sz="4" w:space="0" w:color="000000"/>
-              <w:bottom w:val="single" w:sz="4" w:space="0" w:color="000000"/>
-              <w:right w:val="single" w:sz="4" w:space="0" w:color="000000"/>
-            </w:tcBorders>
           </w:tcPr>
           <w:p>
             <w:pPr>
@@ -1532,12 +1382,6 @@
         </w:tc>
         <w:tc>
           <w:tcPr>
-            <w:tcBorders>
-              <w:top w:val="single" w:sz="4" w:space="0" w:color="000000"/>
-              <w:left w:val="single" w:sz="4" w:space="0" w:color="000000"/>
-              <w:bottom w:val="single" w:sz="4" w:space="0" w:color="000000"/>
-              <w:right w:val="single" w:sz="4" w:space="0" w:color="000000"/>
-            </w:tcBorders>
             <w:tcBorders>
               <w:top w:val="single" w:sz="4" w:space="0" w:color="000000"/>
               <w:left w:val="single" w:sz="4" w:space="0" w:color="000000"/>
@@ -1564,12 +1408,6 @@
               <w:bottom w:val="single" w:sz="4" w:space="0" w:color="000000"/>
               <w:right w:val="single" w:sz="4" w:space="0" w:color="000000"/>
             </w:tcBorders>
-            <w:tcBorders>
-              <w:top w:val="single" w:sz="4" w:space="0" w:color="000000"/>
-              <w:left w:val="single" w:sz="4" w:space="0" w:color="000000"/>
-              <w:bottom w:val="single" w:sz="4" w:space="0" w:color="000000"/>
-              <w:right w:val="single" w:sz="4" w:space="0" w:color="000000"/>
-            </w:tcBorders>
           </w:tcPr>
           <w:p>
             <w:pPr>
@@ -1582,12 +1420,6 @@
         </w:tc>
         <w:tc>
           <w:tcPr>
-            <w:tcBorders>
-              <w:top w:val="single" w:sz="4" w:space="0" w:color="000000"/>
-              <w:left w:val="single" w:sz="4" w:space="0" w:color="000000"/>
-              <w:bottom w:val="single" w:sz="4" w:space="0" w:color="000000"/>
-              <w:right w:val="single" w:sz="4" w:space="0" w:color="000000"/>
-            </w:tcBorders>
             <w:tcBorders>
               <w:top w:val="single" w:sz="4" w:space="0" w:color="000000"/>
               <w:left w:val="single" w:sz="4" w:space="0" w:color="000000"/>
@@ -1611,12 +1443,6 @@
               <w:bottom w:val="single" w:sz="4" w:space="0" w:color="000000"/>
               <w:right w:val="single" w:sz="4" w:space="0" w:color="000000"/>
             </w:tcBorders>
-            <w:tcBorders>
-              <w:top w:val="single" w:sz="4" w:space="0" w:color="000000"/>
-              <w:left w:val="single" w:sz="4" w:space="0" w:color="000000"/>
-              <w:bottom w:val="single" w:sz="4" w:space="0" w:color="000000"/>
-              <w:right w:val="single" w:sz="4" w:space="0" w:color="000000"/>
-            </w:tcBorders>
           </w:tcPr>
           <w:p>
             <w:pPr>
@@ -1629,12 +1455,6 @@
         </w:tc>
         <w:tc>
           <w:tcPr>
-            <w:tcBorders>
-              <w:top w:val="single" w:sz="4" w:space="0" w:color="000000"/>
-              <w:left w:val="single" w:sz="4" w:space="0" w:color="000000"/>
-              <w:bottom w:val="single" w:sz="4" w:space="0" w:color="000000"/>
-              <w:right w:val="single" w:sz="4" w:space="0" w:color="000000"/>
-            </w:tcBorders>
             <w:tcBorders>
               <w:top w:val="single" w:sz="4" w:space="0" w:color="000000"/>
               <w:left w:val="single" w:sz="4" w:space="0" w:color="000000"/>
@@ -1661,12 +1481,6 @@
               <w:bottom w:val="single" w:sz="4" w:space="0" w:color="000000"/>
               <w:right w:val="single" w:sz="4" w:space="0" w:color="000000"/>
             </w:tcBorders>
-            <w:tcBorders>
-              <w:top w:val="single" w:sz="4" w:space="0" w:color="000000"/>
-              <w:left w:val="single" w:sz="4" w:space="0" w:color="000000"/>
-              <w:bottom w:val="single" w:sz="4" w:space="0" w:color="000000"/>
-              <w:right w:val="single" w:sz="4" w:space="0" w:color="000000"/>
-            </w:tcBorders>
           </w:tcPr>
           <w:p>
             <w:pPr>
@@ -1679,12 +1493,6 @@
         </w:tc>
         <w:tc>
           <w:tcPr>
-            <w:tcBorders>
-              <w:top w:val="single" w:sz="4" w:space="0" w:color="000000"/>
-              <w:left w:val="single" w:sz="4" w:space="0" w:color="000000"/>
-              <w:bottom w:val="single" w:sz="4" w:space="0" w:color="000000"/>
-              <w:right w:val="single" w:sz="4" w:space="0" w:color="000000"/>
-            </w:tcBorders>
             <w:tcBorders>
               <w:top w:val="single" w:sz="4" w:space="0" w:color="000000"/>
               <w:left w:val="single" w:sz="4" w:space="0" w:color="000000"/>
@@ -1743,12 +1551,6 @@
               <w:bottom w:val="single" w:sz="4" w:space="0" w:color="000000"/>
               <w:right w:val="single" w:sz="4" w:space="0" w:color="000000"/>
             </w:tcBorders>
-            <w:tcBorders>
-              <w:top w:val="single" w:sz="4" w:space="0" w:color="000000"/>
-              <w:left w:val="single" w:sz="4" w:space="0" w:color="000000"/>
-              <w:bottom w:val="single" w:sz="4" w:space="0" w:color="000000"/>
-              <w:right w:val="single" w:sz="4" w:space="0" w:color="000000"/>
-            </w:tcBorders>
           </w:tcPr>
           <w:p>
             <w:pPr>
@@ -1761,12 +1563,6 @@
         </w:tc>
         <w:tc>
           <w:tcPr>
-            <w:tcBorders>
-              <w:top w:val="single" w:sz="4" w:space="0" w:color="000000"/>
-              <w:left w:val="single" w:sz="4" w:space="0" w:color="000000"/>
-              <w:bottom w:val="single" w:sz="4" w:space="0" w:color="000000"/>
-              <w:right w:val="single" w:sz="4" w:space="0" w:color="000000"/>
-            </w:tcBorders>
             <w:tcBorders>
               <w:top w:val="single" w:sz="4" w:space="0" w:color="000000"/>
               <w:left w:val="single" w:sz="4" w:space="0" w:color="000000"/>
@@ -1787,12 +1583,6 @@
       <w:tr>
         <w:tc>
           <w:tcPr>
-            <w:tcBorders>
-              <w:top w:val="single" w:sz="4" w:space="0" w:color="000000"/>
-              <w:left w:val="single" w:sz="4" w:space="0" w:color="000000"/>
-              <w:bottom w:val="single" w:sz="4" w:space="0" w:color="000000"/>
-              <w:right w:val="single" w:sz="4" w:space="0" w:color="000000"/>
-            </w:tcBorders>
             <w:tcBorders>
               <w:top w:val="single" w:sz="4" w:space="0" w:color="000000"/>
               <w:left w:val="single" w:sz="4" w:space="0" w:color="000000"/>
@@ -1827,12 +1617,6 @@
               <w:bottom w:val="single" w:sz="4" w:space="0" w:color="000000"/>
               <w:right w:val="single" w:sz="4" w:space="0" w:color="000000"/>
             </w:tcBorders>
-            <w:tcBorders>
-              <w:top w:val="single" w:sz="4" w:space="0" w:color="000000"/>
-              <w:left w:val="single" w:sz="4" w:space="0" w:color="000000"/>
-              <w:bottom w:val="single" w:sz="4" w:space="0" w:color="000000"/>
-              <w:right w:val="single" w:sz="4" w:space="0" w:color="000000"/>
-            </w:tcBorders>
           </w:tcPr>
           <w:p>
             <w:pPr>
@@ -1844,12 +1628,6 @@
       <w:tr>
         <w:tc>
           <w:tcPr>
-            <w:tcBorders>
-              <w:top w:val="single" w:sz="4" w:space="0" w:color="000000"/>
-              <w:left w:val="single" w:sz="4" w:space="0" w:color="000000"/>
-              <w:bottom w:val="single" w:sz="4" w:space="0" w:color="000000"/>
-              <w:right w:val="single" w:sz="4" w:space="0" w:color="000000"/>
-            </w:tcBorders>
             <w:tcBorders>
               <w:top w:val="single" w:sz="4" w:space="0" w:color="000000"/>
               <w:left w:val="single" w:sz="4" w:space="0" w:color="000000"/>
@@ -1884,12 +1662,6 @@
               <w:bottom w:val="single" w:sz="4" w:space="0" w:color="000000"/>
               <w:right w:val="single" w:sz="4" w:space="0" w:color="000000"/>
             </w:tcBorders>
-            <w:tcBorders>
-              <w:top w:val="single" w:sz="4" w:space="0" w:color="000000"/>
-              <w:left w:val="single" w:sz="4" w:space="0" w:color="000000"/>
-              <w:bottom w:val="single" w:sz="4" w:space="0" w:color="000000"/>
-              <w:right w:val="single" w:sz="4" w:space="0" w:color="000000"/>
-            </w:tcBorders>
           </w:tcPr>
           <w:p>
             <w:pPr>
@@ -1907,12 +1679,6 @@
               <w:bottom w:val="single" w:sz="4" w:space="0" w:color="000000"/>
               <w:right w:val="single" w:sz="4" w:space="0" w:color="000000"/>
             </w:tcBorders>
-            <w:tcBorders>
-              <w:top w:val="single" w:sz="4" w:space="0" w:color="000000"/>
-              <w:left w:val="single" w:sz="4" w:space="0" w:color="000000"/>
-              <w:bottom w:val="single" w:sz="4" w:space="0" w:color="000000"/>
-              <w:right w:val="single" w:sz="4" w:space="0" w:color="000000"/>
-            </w:tcBorders>
           </w:tcPr>
           <w:p>
             <w:pPr>
@@ -1925,12 +1691,6 @@
         </w:tc>
         <w:tc>
           <w:tcPr>
-            <w:tcBorders>
-              <w:top w:val="single" w:sz="4" w:space="0" w:color="000000"/>
-              <w:left w:val="single" w:sz="4" w:space="0" w:color="000000"/>
-              <w:bottom w:val="single" w:sz="4" w:space="0" w:color="000000"/>
-              <w:right w:val="single" w:sz="4" w:space="0" w:color="000000"/>
-            </w:tcBorders>
             <w:tcBorders>
               <w:top w:val="single" w:sz="4" w:space="0" w:color="000000"/>
               <w:left w:val="single" w:sz="4" w:space="0" w:color="000000"/>
@@ -1989,12 +1749,6 @@
               <w:bottom w:val="single" w:sz="4" w:space="0" w:color="000000"/>
               <w:right w:val="single" w:sz="4" w:space="0" w:color="000000"/>
             </w:tcBorders>
-            <w:tcBorders>
-              <w:top w:val="single" w:sz="4" w:space="0" w:color="000000"/>
-              <w:left w:val="single" w:sz="4" w:space="0" w:color="000000"/>
-              <w:bottom w:val="single" w:sz="4" w:space="0" w:color="000000"/>
-              <w:right w:val="single" w:sz="4" w:space="0" w:color="000000"/>
-            </w:tcBorders>
           </w:tcPr>
           <w:p>
             <w:pPr>
@@ -2007,12 +1761,6 @@
         </w:tc>
         <w:tc>
           <w:tcPr>
-            <w:tcBorders>
-              <w:top w:val="single" w:sz="4" w:space="0" w:color="000000"/>
-              <w:left w:val="single" w:sz="4" w:space="0" w:color="000000"/>
-              <w:bottom w:val="single" w:sz="4" w:space="0" w:color="000000"/>
-              <w:right w:val="single" w:sz="4" w:space="0" w:color="000000"/>
-            </w:tcBorders>
             <w:tcBorders>
               <w:top w:val="single" w:sz="4" w:space="0" w:color="000000"/>
               <w:left w:val="single" w:sz="4" w:space="0" w:color="000000"/>
@@ -2039,12 +1787,6 @@
               <w:bottom w:val="single" w:sz="4" w:space="0" w:color="000000"/>
               <w:right w:val="single" w:sz="4" w:space="0" w:color="000000"/>
             </w:tcBorders>
-            <w:tcBorders>
-              <w:top w:val="single" w:sz="4" w:space="0" w:color="000000"/>
-              <w:left w:val="single" w:sz="4" w:space="0" w:color="000000"/>
-              <w:bottom w:val="single" w:sz="4" w:space="0" w:color="000000"/>
-              <w:right w:val="single" w:sz="4" w:space="0" w:color="000000"/>
-            </w:tcBorders>
           </w:tcPr>
           <w:p>
             <w:pPr>
@@ -2057,12 +1799,6 @@
         </w:tc>
         <w:tc>
           <w:tcPr>
-            <w:tcBorders>
-              <w:top w:val="single" w:sz="4" w:space="0" w:color="000000"/>
-              <w:left w:val="single" w:sz="4" w:space="0" w:color="000000"/>
-              <w:bottom w:val="single" w:sz="4" w:space="0" w:color="000000"/>
-              <w:right w:val="single" w:sz="4" w:space="0" w:color="000000"/>
-            </w:tcBorders>
             <w:tcBorders>
               <w:top w:val="single" w:sz="4" w:space="0" w:color="000000"/>
               <w:left w:val="single" w:sz="4" w:space="0" w:color="000000"/>
@@ -2086,12 +1822,6 @@
               <w:bottom w:val="single" w:sz="4" w:space="0" w:color="000000"/>
               <w:right w:val="single" w:sz="4" w:space="0" w:color="000000"/>
             </w:tcBorders>
-            <w:tcBorders>
-              <w:top w:val="single" w:sz="4" w:space="0" w:color="000000"/>
-              <w:left w:val="single" w:sz="4" w:space="0" w:color="000000"/>
-              <w:bottom w:val="single" w:sz="4" w:space="0" w:color="000000"/>
-              <w:right w:val="single" w:sz="4" w:space="0" w:color="000000"/>
-            </w:tcBorders>
           </w:tcPr>
           <w:p>
             <w:pPr>
@@ -2104,12 +1834,6 @@
         </w:tc>
         <w:tc>
           <w:tcPr>
-            <w:tcBorders>
-              <w:top w:val="single" w:sz="4" w:space="0" w:color="000000"/>
-              <w:left w:val="single" w:sz="4" w:space="0" w:color="000000"/>
-              <w:bottom w:val="single" w:sz="4" w:space="0" w:color="000000"/>
-              <w:right w:val="single" w:sz="4" w:space="0" w:color="000000"/>
-            </w:tcBorders>
             <w:tcBorders>
               <w:top w:val="single" w:sz="4" w:space="0" w:color="000000"/>
               <w:left w:val="single" w:sz="4" w:space="0" w:color="000000"/>
@@ -2136,12 +1860,6 @@
               <w:bottom w:val="single" w:sz="4" w:space="0" w:color="000000"/>
               <w:right w:val="single" w:sz="4" w:space="0" w:color="000000"/>
             </w:tcBorders>
-            <w:tcBorders>
-              <w:top w:val="single" w:sz="4" w:space="0" w:color="000000"/>
-              <w:left w:val="single" w:sz="4" w:space="0" w:color="000000"/>
-              <w:bottom w:val="single" w:sz="4" w:space="0" w:color="000000"/>
-              <w:right w:val="single" w:sz="4" w:space="0" w:color="000000"/>
-            </w:tcBorders>
           </w:tcPr>
           <w:p>
             <w:pPr>
@@ -2154,12 +1872,6 @@
         </w:tc>
         <w:tc>
           <w:tcPr>
-            <w:tcBorders>
-              <w:top w:val="single" w:sz="4" w:space="0" w:color="000000"/>
-              <w:left w:val="single" w:sz="4" w:space="0" w:color="000000"/>
-              <w:bottom w:val="single" w:sz="4" w:space="0" w:color="000000"/>
-              <w:right w:val="single" w:sz="4" w:space="0" w:color="000000"/>
-            </w:tcBorders>
             <w:tcBorders>
               <w:top w:val="single" w:sz="4" w:space="0" w:color="000000"/>
               <w:left w:val="single" w:sz="4" w:space="0" w:color="000000"/>
@@ -2218,12 +1930,6 @@
               <w:bottom w:val="single" w:sz="4" w:space="0" w:color="000000"/>
               <w:right w:val="single" w:sz="4" w:space="0" w:color="000000"/>
             </w:tcBorders>
-            <w:tcBorders>
-              <w:top w:val="single" w:sz="4" w:space="0" w:color="000000"/>
-              <w:left w:val="single" w:sz="4" w:space="0" w:color="000000"/>
-              <w:bottom w:val="single" w:sz="4" w:space="0" w:color="000000"/>
-              <w:right w:val="single" w:sz="4" w:space="0" w:color="000000"/>
-            </w:tcBorders>
           </w:tcPr>
           <w:p>
             <w:pPr>
@@ -2236,12 +1942,6 @@
         </w:tc>
         <w:tc>
           <w:tcPr>
-            <w:tcBorders>
-              <w:top w:val="single" w:sz="4" w:space="0" w:color="000000"/>
-              <w:left w:val="single" w:sz="4" w:space="0" w:color="000000"/>
-              <w:bottom w:val="single" w:sz="4" w:space="0" w:color="000000"/>
-              <w:right w:val="single" w:sz="4" w:space="0" w:color="000000"/>
-            </w:tcBorders>
             <w:tcBorders>
               <w:top w:val="single" w:sz="4" w:space="0" w:color="000000"/>
               <w:left w:val="single" w:sz="4" w:space="0" w:color="000000"/>
@@ -2268,12 +1968,6 @@
               <w:bottom w:val="single" w:sz="4" w:space="0" w:color="000000"/>
               <w:right w:val="single" w:sz="4" w:space="0" w:color="000000"/>
             </w:tcBorders>
-            <w:tcBorders>
-              <w:top w:val="single" w:sz="4" w:space="0" w:color="000000"/>
-              <w:left w:val="single" w:sz="4" w:space="0" w:color="000000"/>
-              <w:bottom w:val="single" w:sz="4" w:space="0" w:color="000000"/>
-              <w:right w:val="single" w:sz="4" w:space="0" w:color="000000"/>
-            </w:tcBorders>
           </w:tcPr>
           <w:p>
             <w:pPr>
@@ -2286,12 +1980,6 @@
         </w:tc>
         <w:tc>
           <w:tcPr>
-            <w:tcBorders>
-              <w:top w:val="single" w:sz="4" w:space="0" w:color="000000"/>
-              <w:left w:val="single" w:sz="4" w:space="0" w:color="000000"/>
-              <w:bottom w:val="single" w:sz="4" w:space="0" w:color="000000"/>
-              <w:right w:val="single" w:sz="4" w:space="0" w:color="000000"/>
-            </w:tcBorders>
             <w:tcBorders>
               <w:top w:val="single" w:sz="4" w:space="0" w:color="000000"/>
               <w:left w:val="single" w:sz="4" w:space="0" w:color="000000"/>
@@ -2315,12 +2003,6 @@
               <w:bottom w:val="single" w:sz="4" w:space="0" w:color="000000"/>
               <w:right w:val="single" w:sz="4" w:space="0" w:color="000000"/>
             </w:tcBorders>
-            <w:tcBorders>
-              <w:top w:val="single" w:sz="4" w:space="0" w:color="000000"/>
-              <w:left w:val="single" w:sz="4" w:space="0" w:color="000000"/>
-              <w:bottom w:val="single" w:sz="4" w:space="0" w:color="000000"/>
-              <w:right w:val="single" w:sz="4" w:space="0" w:color="000000"/>
-            </w:tcBorders>
           </w:tcPr>
           <w:p>
             <w:pPr>
@@ -2333,12 +2015,6 @@
         </w:tc>
         <w:tc>
           <w:tcPr>
-            <w:tcBorders>
-              <w:top w:val="single" w:sz="4" w:space="0" w:color="000000"/>
-              <w:left w:val="single" w:sz="4" w:space="0" w:color="000000"/>
-              <w:bottom w:val="single" w:sz="4" w:space="0" w:color="000000"/>
-              <w:right w:val="single" w:sz="4" w:space="0" w:color="000000"/>
-            </w:tcBorders>
             <w:tcBorders>
               <w:top w:val="single" w:sz="4" w:space="0" w:color="000000"/>
               <w:left w:val="single" w:sz="4" w:space="0" w:color="000000"/>
@@ -2362,12 +2038,6 @@
               <w:bottom w:val="single" w:sz="4" w:space="0" w:color="000000"/>
               <w:right w:val="single" w:sz="4" w:space="0" w:color="000000"/>
             </w:tcBorders>
-            <w:tcBorders>
-              <w:top w:val="single" w:sz="4" w:space="0" w:color="000000"/>
-              <w:left w:val="single" w:sz="4" w:space="0" w:color="000000"/>
-              <w:bottom w:val="single" w:sz="4" w:space="0" w:color="000000"/>
-              <w:right w:val="single" w:sz="4" w:space="0" w:color="000000"/>
-            </w:tcBorders>
           </w:tcPr>
           <w:p>
             <w:pPr>
@@ -2380,12 +2050,6 @@
         </w:tc>
         <w:tc>
           <w:tcPr>
-            <w:tcBorders>
-              <w:top w:val="single" w:sz="4" w:space="0" w:color="000000"/>
-              <w:left w:val="single" w:sz="4" w:space="0" w:color="000000"/>
-              <w:bottom w:val="single" w:sz="4" w:space="0" w:color="000000"/>
-              <w:right w:val="single" w:sz="4" w:space="0" w:color="000000"/>
-            </w:tcBorders>
             <w:tcBorders>
               <w:top w:val="single" w:sz="4" w:space="0" w:color="000000"/>
               <w:left w:val="single" w:sz="4" w:space="0" w:color="000000"/>
@@ -2406,12 +2070,6 @@
       <w:tr>
         <w:tc>
           <w:tcPr>
-            <w:tcBorders>
-              <w:top w:val="single" w:sz="4" w:space="0" w:color="000000"/>
-              <w:left w:val="single" w:sz="4" w:space="0" w:color="000000"/>
-              <w:bottom w:val="single" w:sz="4" w:space="0" w:color="000000"/>
-              <w:right w:val="single" w:sz="4" w:space="0" w:color="000000"/>
-            </w:tcBorders>
             <w:tcBorders>
               <w:top w:val="single" w:sz="4" w:space="0" w:color="000000"/>
               <w:left w:val="single" w:sz="4" w:space="0" w:color="000000"/>
@@ -2440,12 +2098,6 @@
         </w:tc>
         <w:tc>
           <w:tcPr>
-            <w:tcBorders>
-              <w:top w:val="single" w:sz="4" w:space="0" w:color="000000"/>
-              <w:left w:val="single" w:sz="4" w:space="0" w:color="000000"/>
-              <w:bottom w:val="single" w:sz="4" w:space="0" w:color="000000"/>
-              <w:right w:val="single" w:sz="4" w:space="0" w:color="000000"/>
-            </w:tcBorders>
             <w:tcBorders>
               <w:top w:val="single" w:sz="4" w:space="0" w:color="000000"/>
               <w:left w:val="single" w:sz="4" w:space="0" w:color="000000"/>
@@ -2501,12 +2153,6 @@
               <w:bottom w:val="single" w:sz="4" w:space="0" w:color="000000"/>
               <w:right w:val="single" w:sz="4" w:space="0" w:color="000000"/>
             </w:tcBorders>
-            <w:tcBorders>
-              <w:top w:val="single" w:sz="4" w:space="0" w:color="000000"/>
-              <w:left w:val="single" w:sz="4" w:space="0" w:color="000000"/>
-              <w:bottom w:val="single" w:sz="4" w:space="0" w:color="000000"/>
-              <w:right w:val="single" w:sz="4" w:space="0" w:color="000000"/>
-            </w:tcBorders>
           </w:tcPr>
           <w:p>
             <w:pPr>
@@ -2519,12 +2165,6 @@
         </w:tc>
         <w:tc>
           <w:tcPr>
-            <w:tcBorders>
-              <w:top w:val="single" w:sz="4" w:space="0" w:color="000000"/>
-              <w:left w:val="single" w:sz="4" w:space="0" w:color="000000"/>
-              <w:bottom w:val="single" w:sz="4" w:space="0" w:color="000000"/>
-              <w:right w:val="single" w:sz="4" w:space="0" w:color="000000"/>
-            </w:tcBorders>
             <w:tcBorders>
               <w:top w:val="single" w:sz="4" w:space="0" w:color="000000"/>
               <w:left w:val="single" w:sz="4" w:space="0" w:color="000000"/>
@@ -2551,12 +2191,6 @@
               <w:bottom w:val="single" w:sz="4" w:space="0" w:color="000000"/>
               <w:right w:val="single" w:sz="4" w:space="0" w:color="000000"/>
             </w:tcBorders>
-            <w:tcBorders>
-              <w:top w:val="single" w:sz="4" w:space="0" w:color="000000"/>
-              <w:left w:val="single" w:sz="4" w:space="0" w:color="000000"/>
-              <w:bottom w:val="single" w:sz="4" w:space="0" w:color="000000"/>
-              <w:right w:val="single" w:sz="4" w:space="0" w:color="000000"/>
-            </w:tcBorders>
           </w:tcPr>
           <w:p>
             <w:pPr>
@@ -2569,12 +2203,6 @@
         </w:tc>
         <w:tc>
           <w:tcPr>
-            <w:tcBorders>
-              <w:top w:val="single" w:sz="4" w:space="0" w:color="000000"/>
-              <w:left w:val="single" w:sz="4" w:space="0" w:color="000000"/>
-              <w:bottom w:val="single" w:sz="4" w:space="0" w:color="000000"/>
-              <w:right w:val="single" w:sz="4" w:space="0" w:color="000000"/>
-            </w:tcBorders>
             <w:tcBorders>
               <w:top w:val="single" w:sz="4" w:space="0" w:color="000000"/>
               <w:left w:val="single" w:sz="4" w:space="0" w:color="000000"/>
@@ -2598,12 +2226,6 @@
               <w:bottom w:val="single" w:sz="4" w:space="0" w:color="000000"/>
               <w:right w:val="single" w:sz="4" w:space="0" w:color="000000"/>
             </w:tcBorders>
-            <w:tcBorders>
-              <w:top w:val="single" w:sz="4" w:space="0" w:color="000000"/>
-              <w:left w:val="single" w:sz="4" w:space="0" w:color="000000"/>
-              <w:bottom w:val="single" w:sz="4" w:space="0" w:color="000000"/>
-              <w:right w:val="single" w:sz="4" w:space="0" w:color="000000"/>
-            </w:tcBorders>
           </w:tcPr>
           <w:p>
             <w:pPr>
@@ -2616,12 +2238,6 @@
         </w:tc>
         <w:tc>
           <w:tcPr>
-            <w:tcBorders>
-              <w:top w:val="single" w:sz="4" w:space="0" w:color="000000"/>
-              <w:left w:val="single" w:sz="4" w:space="0" w:color="000000"/>
-              <w:bottom w:val="single" w:sz="4" w:space="0" w:color="000000"/>
-              <w:right w:val="single" w:sz="4" w:space="0" w:color="000000"/>
-            </w:tcBorders>
             <w:tcBorders>
               <w:top w:val="single" w:sz="4" w:space="0" w:color="000000"/>
               <w:left w:val="single" w:sz="4" w:space="0" w:color="000000"/>
@@ -2645,12 +2261,6 @@
               <w:bottom w:val="single" w:sz="4" w:space="0" w:color="000000"/>
               <w:right w:val="single" w:sz="4" w:space="0" w:color="000000"/>
             </w:tcBorders>
-            <w:tcBorders>
-              <w:top w:val="single" w:sz="4" w:space="0" w:color="000000"/>
-              <w:left w:val="single" w:sz="4" w:space="0" w:color="000000"/>
-              <w:bottom w:val="single" w:sz="4" w:space="0" w:color="000000"/>
-              <w:right w:val="single" w:sz="4" w:space="0" w:color="000000"/>
-            </w:tcBorders>
           </w:tcPr>
           <w:p>
             <w:pPr>
@@ -2663,12 +2273,6 @@
         </w:tc>
         <w:tc>
           <w:tcPr>
-            <w:tcBorders>
-              <w:top w:val="single" w:sz="4" w:space="0" w:color="000000"/>
-              <w:left w:val="single" w:sz="4" w:space="0" w:color="000000"/>
-              <w:bottom w:val="single" w:sz="4" w:space="0" w:color="000000"/>
-              <w:right w:val="single" w:sz="4" w:space="0" w:color="000000"/>
-            </w:tcBorders>
             <w:tcBorders>
               <w:top w:val="single" w:sz="4" w:space="0" w:color="000000"/>
               <w:left w:val="single" w:sz="4" w:space="0" w:color="000000"/>
@@ -2692,12 +2296,6 @@
               <w:bottom w:val="single" w:sz="4" w:space="0" w:color="000000"/>
               <w:right w:val="single" w:sz="4" w:space="0" w:color="000000"/>
             </w:tcBorders>
-            <w:tcBorders>
-              <w:top w:val="single" w:sz="4" w:space="0" w:color="000000"/>
-              <w:left w:val="single" w:sz="4" w:space="0" w:color="000000"/>
-              <w:bottom w:val="single" w:sz="4" w:space="0" w:color="000000"/>
-              <w:right w:val="single" w:sz="4" w:space="0" w:color="000000"/>
-            </w:tcBorders>
           </w:tcPr>
           <w:p>
             <w:pPr>
@@ -2710,12 +2308,6 @@
         </w:tc>
         <w:tc>
           <w:tcPr>
-            <w:tcBorders>
-              <w:top w:val="single" w:sz="4" w:space="0" w:color="000000"/>
-              <w:left w:val="single" w:sz="4" w:space="0" w:color="000000"/>
-              <w:bottom w:val="single" w:sz="4" w:space="0" w:color="000000"/>
-              <w:right w:val="single" w:sz="4" w:space="0" w:color="000000"/>
-            </w:tcBorders>
             <w:tcBorders>
               <w:top w:val="single" w:sz="4" w:space="0" w:color="000000"/>
               <w:left w:val="single" w:sz="4" w:space="0" w:color="000000"/>
@@ -2781,12 +2373,6 @@
               <w:bottom w:val="single" w:sz="4" w:space="0" w:color="000000"/>
               <w:right w:val="single" w:sz="4" w:space="0" w:color="000000"/>
             </w:tcBorders>
-            <w:tcBorders>
-              <w:top w:val="single" w:sz="4" w:space="0" w:color="000000"/>
-              <w:left w:val="single" w:sz="4" w:space="0" w:color="000000"/>
-              <w:bottom w:val="single" w:sz="4" w:space="0" w:color="000000"/>
-              <w:right w:val="single" w:sz="4" w:space="0" w:color="000000"/>
-            </w:tcBorders>
           </w:tcPr>
           <w:p>
             <w:pPr>
@@ -2799,12 +2385,6 @@
         </w:tc>
         <w:tc>
           <w:tcPr>
-            <w:tcBorders>
-              <w:top w:val="single" w:sz="4" w:space="0" w:color="000000"/>
-              <w:left w:val="single" w:sz="4" w:space="0" w:color="000000"/>
-              <w:bottom w:val="single" w:sz="4" w:space="0" w:color="000000"/>
-              <w:right w:val="single" w:sz="4" w:space="0" w:color="000000"/>
-            </w:tcBorders>
             <w:tcBorders>
               <w:top w:val="single" w:sz="4" w:space="0" w:color="000000"/>
               <w:left w:val="single" w:sz="4" w:space="0" w:color="000000"/>
@@ -2831,6 +2411,42 @@
               <w:bottom w:val="single" w:sz="4" w:space="0" w:color="000000"/>
               <w:right w:val="single" w:sz="4" w:space="0" w:color="000000"/>
             </w:tcBorders>
+          </w:tcPr>
+          <w:p>
+            <w:pPr>
+              <w:pStyle w:val="Compact"/>
+            </w:pPr>
+            <w:r>
+              <w:rPr>
+                <w:b/>
+                <w:bCs/>
+              </w:rPr>
+              <w:t xml:space="preserve">4 - Destacado</w:t>
+            </w:r>
+          </w:p>
+        </w:tc>
+        <w:tc>
+          <w:tcPr>
+            <w:tcBorders>
+              <w:top w:val="single" w:sz="4" w:space="0" w:color="000000"/>
+              <w:left w:val="single" w:sz="4" w:space="0" w:color="000000"/>
+              <w:bottom w:val="single" w:sz="4" w:space="0" w:color="000000"/>
+              <w:right w:val="single" w:sz="4" w:space="0" w:color="000000"/>
+            </w:tcBorders>
+          </w:tcPr>
+          <w:p>
+            <w:pPr>
+              <w:pStyle w:val="Compact"/>
+            </w:pPr>
+            <w:r>
+              <w:t xml:space="preserve">El formato incluye todos los elementos de la lista de verificación. Está escrito en lenguaje que un estudiante puede entender sin explicación adicional. La opción de rechazar participar es visualmente equivalente a la de aceptar.</w:t>
+            </w:r>
+          </w:p>
+        </w:tc>
+      </w:tr>
+      <w:tr>
+        <w:tc>
+          <w:tcPr>
             <w:tcBorders>
               <w:top w:val="single" w:sz="4" w:space="0" w:color="000000"/>
               <w:left w:val="single" w:sz="4" w:space="0" w:color="000000"/>
@@ -2859,19 +2475,13 @@
               <w:bottom w:val="single" w:sz="4" w:space="0" w:color="000000"/>
               <w:right w:val="single" w:sz="4" w:space="0" w:color="000000"/>
             </w:tcBorders>
-            <w:tcBorders>
-              <w:top w:val="single" w:sz="4" w:space="0" w:color="000000"/>
-              <w:left w:val="single" w:sz="4" w:space="0" w:color="000000"/>
-              <w:bottom w:val="single" w:sz="4" w:space="0" w:color="000000"/>
-              <w:right w:val="single" w:sz="4" w:space="0" w:color="000000"/>
-            </w:tcBorders>
-          </w:tcPr>
-          <w:p>
-            <w:pPr>
-              <w:pStyle w:val="Compact"/>
-            </w:pPr>
-            <w:r>
-              <w:t xml:space="preserve">El formato incluye todos los elementos de la lista de verificación. Está escrito en lenguaje que un estudiante puede entender sin explicación adicional. La opción de rechazar participar es visualmente equivalente a la de aceptar.</w:t>
+          </w:tcPr>
+          <w:p>
+            <w:pPr>
+              <w:pStyle w:val="Compact"/>
+            </w:pPr>
+            <w:r>
+              <w:t xml:space="preserve">El formato tiene la mayoría de los elementos pero le faltan uno o dos (típicamente: no especifica el periodo de retención, o no menciona qué pasa si el estudiante se retira).</w:t>
             </w:r>
           </w:p>
         </w:tc>
@@ -2879,12 +2489,6 @@
       <w:tr>
         <w:tc>
           <w:tcPr>
-            <w:tcBorders>
-              <w:top w:val="single" w:sz="4" w:space="0" w:color="000000"/>
-              <w:left w:val="single" w:sz="4" w:space="0" w:color="000000"/>
-              <w:bottom w:val="single" w:sz="4" w:space="0" w:color="000000"/>
-              <w:right w:val="single" w:sz="4" w:space="0" w:color="000000"/>
-            </w:tcBorders>
             <w:tcBorders>
               <w:top w:val="single" w:sz="4" w:space="0" w:color="000000"/>
               <w:left w:val="single" w:sz="4" w:space="0" w:color="000000"/>
@@ -2901,72 +2505,12 @@
                 <w:b/>
                 <w:bCs/>
               </w:rPr>
-              <w:t xml:space="preserve">2 - En desarrollo</w:t>
-            </w:r>
-          </w:p>
-        </w:tc>
-        <w:tc>
-          <w:tcPr>
-            <w:tcBorders>
-              <w:top w:val="single" w:sz="4" w:space="0" w:color="000000"/>
-              <w:left w:val="single" w:sz="4" w:space="0" w:color="000000"/>
-              <w:bottom w:val="single" w:sz="4" w:space="0" w:color="000000"/>
-              <w:right w:val="single" w:sz="4" w:space="0" w:color="000000"/>
-            </w:tcBorders>
-            <w:tcBorders>
-              <w:top w:val="single" w:sz="4" w:space="0" w:color="000000"/>
-              <w:left w:val="single" w:sz="4" w:space="0" w:color="000000"/>
-              <w:bottom w:val="single" w:sz="4" w:space="0" w:color="000000"/>
-              <w:right w:val="single" w:sz="4" w:space="0" w:color="000000"/>
-            </w:tcBorders>
-          </w:tcPr>
-          <w:p>
-            <w:pPr>
-              <w:pStyle w:val="Compact"/>
-            </w:pPr>
-            <w:r>
-              <w:t xml:space="preserve">El formato tiene la mayoría de los elementos pero le faltan uno o dos (típicamente: no especifica el periodo de retención, o no menciona qué pasa si el estudiante se retira).</w:t>
-            </w:r>
-          </w:p>
-        </w:tc>
-      </w:tr>
-      <w:tr>
-        <w:tc>
-          <w:tcPr>
-            <w:tcBorders>
-              <w:top w:val="single" w:sz="4" w:space="0" w:color="000000"/>
-              <w:left w:val="single" w:sz="4" w:space="0" w:color="000000"/>
-              <w:bottom w:val="single" w:sz="4" w:space="0" w:color="000000"/>
-              <w:right w:val="single" w:sz="4" w:space="0" w:color="000000"/>
-            </w:tcBorders>
-            <w:tcBorders>
-              <w:top w:val="single" w:sz="4" w:space="0" w:color="000000"/>
-              <w:left w:val="single" w:sz="4" w:space="0" w:color="000000"/>
-              <w:bottom w:val="single" w:sz="4" w:space="0" w:color="000000"/>
-              <w:right w:val="single" w:sz="4" w:space="0" w:color="000000"/>
-            </w:tcBorders>
-          </w:tcPr>
-          <w:p>
-            <w:pPr>
-              <w:pStyle w:val="Compact"/>
-            </w:pPr>
-            <w:r>
-              <w:rPr>
-                <w:b/>
-                <w:bCs/>
-              </w:rPr>
-              <w:t xml:space="preserve">1 - Inicial</w:t>
-            </w:r>
-          </w:p>
-        </w:tc>
-        <w:tc>
-          <w:tcPr>
-            <w:tcBorders>
-              <w:top w:val="single" w:sz="4" w:space="0" w:color="000000"/>
-              <w:left w:val="single" w:sz="4" w:space="0" w:color="000000"/>
-              <w:bottom w:val="single" w:sz="4" w:space="0" w:color="000000"/>
-              <w:right w:val="single" w:sz="4" w:space="0" w:color="000000"/>
-            </w:tcBorders>
+              <w:t xml:space="preserve">2 - Básico</w:t>
+            </w:r>
+          </w:p>
+        </w:tc>
+        <w:tc>
+          <w:tcPr>
             <w:tcBorders>
               <w:top w:val="single" w:sz="4" w:space="0" w:color="000000"/>
               <w:left w:val="single" w:sz="4" w:space="0" w:color="000000"/>

</xml_diff>